<commit_message>
Update the ISO image in the concept paper tempalte
</commit_message>
<xml_diff>
--- a/ms-word-templates/concept-paper-with-header-and-footer-template.docx
+++ b/ms-word-templates/concept-paper-with-header-and-footer-template.docx
@@ -154,13 +154,13 @@
         <w:noProof/>
       </w:rPr>
       <w:drawing>
-        <wp:anchor distT="0" distB="0" distL="114300" distR="114300" simplePos="0" relativeHeight="251670528" behindDoc="0" locked="0" layoutInCell="1" allowOverlap="1" wp14:anchorId="7A8CB0FF" wp14:editId="026F1A8E">
+        <wp:anchor distT="0" distB="0" distL="114300" distR="114300" simplePos="0" relativeHeight="251670528" behindDoc="0" locked="0" layoutInCell="1" allowOverlap="1" wp14:anchorId="7A8CB0FF" wp14:editId="465646F1">
           <wp:simplePos x="0" y="0"/>
           <wp:positionH relativeFrom="column">
-            <wp:posOffset>4194810</wp:posOffset>
+            <wp:posOffset>3956685</wp:posOffset>
           </wp:positionH>
           <wp:positionV relativeFrom="paragraph">
-            <wp:posOffset>9525</wp:posOffset>
+            <wp:posOffset>85725</wp:posOffset>
           </wp:positionV>
           <wp:extent cx="638175" cy="894715"/>
           <wp:effectExtent l="0" t="0" r="9525" b="635"/>
@@ -218,10 +218,77 @@
         <w:noProof/>
       </w:rPr>
       <w:drawing>
-        <wp:anchor distT="0" distB="0" distL="114300" distR="114300" simplePos="0" relativeHeight="251671552" behindDoc="0" locked="0" layoutInCell="1" allowOverlap="1" wp14:anchorId="7B5A6D0F" wp14:editId="5716D07C">
+        <wp:anchor distT="0" distB="0" distL="114300" distR="114300" simplePos="0" relativeHeight="251675648" behindDoc="0" locked="0" layoutInCell="1" allowOverlap="1" wp14:anchorId="00E5318A" wp14:editId="2F8E07F6">
           <wp:simplePos x="0" y="0"/>
           <wp:positionH relativeFrom="column">
-            <wp:posOffset>-523240</wp:posOffset>
+            <wp:posOffset>4667250</wp:posOffset>
+          </wp:positionH>
+          <wp:positionV relativeFrom="paragraph">
+            <wp:posOffset>152400</wp:posOffset>
+          </wp:positionV>
+          <wp:extent cx="1741170" cy="626110"/>
+          <wp:effectExtent l="0" t="0" r="0" b="2540"/>
+          <wp:wrapNone/>
+          <wp:docPr id="1360666546" name="Picture 5" descr="A close-up of a white card&#10;&#10;Description automatically generated"/>
+          <wp:cNvGraphicFramePr>
+            <a:graphicFrameLocks xmlns:a="http://schemas.openxmlformats.org/drawingml/2006/main" noChangeAspect="1"/>
+          </wp:cNvGraphicFramePr>
+          <a:graphic xmlns:a="http://schemas.openxmlformats.org/drawingml/2006/main">
+            <a:graphicData uri="http://schemas.openxmlformats.org/drawingml/2006/picture">
+              <pic:pic xmlns:pic="http://schemas.openxmlformats.org/drawingml/2006/picture">
+                <pic:nvPicPr>
+                  <pic:cNvPr id="1360666546" name="Picture 5" descr="A close-up of a white card&#10;&#10;Description automatically generated"/>
+                  <pic:cNvPicPr>
+                    <a:picLocks noChangeAspect="1" noChangeArrowheads="1"/>
+                  </pic:cNvPicPr>
+                </pic:nvPicPr>
+                <pic:blipFill>
+                  <a:blip r:embed="rId2">
+                    <a:extLst>
+                      <a:ext uri="{28A0092B-C50C-407E-A947-70E740481C1C}">
+                        <a14:useLocalDpi xmlns:a14="http://schemas.microsoft.com/office/drawing/2010/main" val="0"/>
+                      </a:ext>
+                    </a:extLst>
+                  </a:blip>
+                  <a:srcRect/>
+                  <a:stretch>
+                    <a:fillRect/>
+                  </a:stretch>
+                </pic:blipFill>
+                <pic:spPr bwMode="auto">
+                  <a:xfrm>
+                    <a:off x="0" y="0"/>
+                    <a:ext cx="1741170" cy="626110"/>
+                  </a:xfrm>
+                  <a:prstGeom prst="rect">
+                    <a:avLst/>
+                  </a:prstGeom>
+                  <a:noFill/>
+                  <a:ln>
+                    <a:noFill/>
+                  </a:ln>
+                </pic:spPr>
+              </pic:pic>
+            </a:graphicData>
+          </a:graphic>
+          <wp14:sizeRelH relativeFrom="margin">
+            <wp14:pctWidth>0</wp14:pctWidth>
+          </wp14:sizeRelH>
+          <wp14:sizeRelV relativeFrom="margin">
+            <wp14:pctHeight>0</wp14:pctHeight>
+          </wp14:sizeRelV>
+        </wp:anchor>
+      </w:drawing>
+    </w:r>
+    <w:r>
+      <w:rPr>
+        <w:noProof/>
+      </w:rPr>
+      <w:drawing>
+        <wp:anchor distT="0" distB="0" distL="114300" distR="114300" simplePos="0" relativeHeight="251671552" behindDoc="0" locked="0" layoutInCell="1" allowOverlap="1" wp14:anchorId="7B5A6D0F" wp14:editId="2B4AD751">
+          <wp:simplePos x="0" y="0"/>
+          <wp:positionH relativeFrom="column">
+            <wp:posOffset>-675640</wp:posOffset>
           </wp:positionH>
           <wp:positionV relativeFrom="paragraph">
             <wp:posOffset>-66675</wp:posOffset>
@@ -243,7 +310,7 @@
                   </pic:cNvPicPr>
                 </pic:nvPicPr>
                 <pic:blipFill>
-                  <a:blip r:embed="rId2">
+                  <a:blip r:embed="rId3">
                     <a:extLst>
                       <a:ext uri="{28A0092B-C50C-407E-A947-70E740481C1C}">
                         <a14:useLocalDpi xmlns:a14="http://schemas.microsoft.com/office/drawing/2010/main" val="0"/>
@@ -284,74 +351,11 @@
     <w:pPr>
       <w:pStyle w:val="Header"/>
     </w:pPr>
-    <w:r>
-      <w:rPr>
-        <w:noProof/>
-      </w:rPr>
-      <w:drawing>
-        <wp:anchor distT="0" distB="0" distL="114300" distR="114300" simplePos="0" relativeHeight="251672576" behindDoc="1" locked="0" layoutInCell="1" allowOverlap="1" wp14:anchorId="21491584" wp14:editId="0BCB3515">
-          <wp:simplePos x="0" y="0"/>
-          <wp:positionH relativeFrom="margin">
-            <wp:posOffset>4918075</wp:posOffset>
-          </wp:positionH>
-          <wp:positionV relativeFrom="paragraph">
-            <wp:posOffset>8255</wp:posOffset>
-          </wp:positionV>
-          <wp:extent cx="1278890" cy="558800"/>
-          <wp:effectExtent l="0" t="0" r="0" b="0"/>
-          <wp:wrapNone/>
-          <wp:docPr id="1819539038" name="Picture 1"/>
-          <wp:cNvGraphicFramePr>
-            <a:graphicFrameLocks xmlns:a="http://schemas.openxmlformats.org/drawingml/2006/main" noChangeAspect="1"/>
-          </wp:cNvGraphicFramePr>
-          <a:graphic xmlns:a="http://schemas.openxmlformats.org/drawingml/2006/main">
-            <a:graphicData uri="http://schemas.openxmlformats.org/drawingml/2006/picture">
-              <pic:pic xmlns:pic="http://schemas.openxmlformats.org/drawingml/2006/picture">
-                <pic:nvPicPr>
-                  <pic:cNvPr id="0" name="Picture 2"/>
-                  <pic:cNvPicPr>
-                    <a:picLocks noChangeAspect="1" noChangeArrowheads="1"/>
-                  </pic:cNvPicPr>
-                </pic:nvPicPr>
-                <pic:blipFill>
-                  <a:blip r:embed="rId3">
-                    <a:extLst>
-                      <a:ext uri="{28A0092B-C50C-407E-A947-70E740481C1C}">
-                        <a14:useLocalDpi xmlns:a14="http://schemas.microsoft.com/office/drawing/2010/main" val="0"/>
-                      </a:ext>
-                    </a:extLst>
-                  </a:blip>
-                  <a:srcRect/>
-                  <a:stretch>
-                    <a:fillRect/>
-                  </a:stretch>
-                </pic:blipFill>
-                <pic:spPr bwMode="auto">
-                  <a:xfrm>
-                    <a:off x="0" y="0"/>
-                    <a:ext cx="1278890" cy="558800"/>
-                  </a:xfrm>
-                  <a:prstGeom prst="rect">
-                    <a:avLst/>
-                  </a:prstGeom>
-                  <a:noFill/>
-                </pic:spPr>
-              </pic:pic>
-            </a:graphicData>
-          </a:graphic>
-          <wp14:sizeRelH relativeFrom="page">
-            <wp14:pctWidth>0</wp14:pctWidth>
-          </wp14:sizeRelH>
-          <wp14:sizeRelV relativeFrom="page">
-            <wp14:pctHeight>0</wp14:pctHeight>
-          </wp14:sizeRelV>
-        </wp:anchor>
-      </w:drawing>
-    </w:r>
   </w:p>
   <w:p>
     <w:pPr>
       <w:pStyle w:val="Header"/>
+      <w:jc w:val="right"/>
     </w:pPr>
   </w:p>
   <w:p>
@@ -370,15 +374,15 @@
       <mc:AlternateContent>
         <mc:Choice Requires="wps">
           <w:drawing>
-            <wp:anchor distT="0" distB="0" distL="114300" distR="114300" simplePos="0" relativeHeight="251673600" behindDoc="0" locked="0" layoutInCell="1" allowOverlap="1" wp14:anchorId="0DC02F17" wp14:editId="20DB2B45">
+            <wp:anchor distT="0" distB="0" distL="114300" distR="114300" simplePos="0" relativeHeight="251673600" behindDoc="0" locked="0" layoutInCell="1" allowOverlap="1" wp14:anchorId="0DC02F17" wp14:editId="35476688">
               <wp:simplePos x="0" y="0"/>
               <wp:positionH relativeFrom="column">
-                <wp:posOffset>4271645</wp:posOffset>
+                <wp:posOffset>4533900</wp:posOffset>
               </wp:positionH>
               <wp:positionV relativeFrom="paragraph">
-                <wp:posOffset>118745</wp:posOffset>
+                <wp:posOffset>89535</wp:posOffset>
               </wp:positionV>
-              <wp:extent cx="2513330" cy="315595"/>
+              <wp:extent cx="1981200" cy="315595"/>
               <wp:effectExtent l="0" t="0" r="0" b="0"/>
               <wp:wrapNone/>
               <wp:docPr id="2042251983" name="Text Box 4"/>
@@ -394,7 +398,7 @@
                     <wps:spPr bwMode="auto">
                       <a:xfrm>
                         <a:off x="0" y="0"/>
-                        <a:ext cx="2513330" cy="315595"/>
+                        <a:ext cx="1981200" cy="315595"/>
                       </a:xfrm>
                       <a:prstGeom prst="rect">
                         <a:avLst/>
@@ -413,13 +417,18 @@
                           <w:pPr>
                             <w:spacing w:line="256" w:lineRule="auto"/>
                             <w:jc w:val="center"/>
+                            <w:rPr>
+                              <w:sz w:val="24"/>
+                              <w:szCs w:val="24"/>
+                            </w:rPr>
                           </w:pPr>
                           <w:r>
                             <w:rPr>
                               <w:b/>
                               <w:i/>
                               <w:color w:val="000000"/>
-                              <w:sz w:val="20"/>
+                              <w:sz w:val="24"/>
+                              <w:szCs w:val="24"/>
                             </w:rPr>
                             <w:t>College of Computer Studies</w:t>
                           </w:r>
@@ -432,7 +441,8 @@
                               <w:rFonts w:asciiTheme="minorHAnsi" w:hAnsiTheme="minorHAnsi"/>
                               <w:i/>
                               <w:color w:val="FF0000"/>
-                              <w:sz w:val="22"/>
+                              <w:sz w:val="24"/>
+                              <w:szCs w:val="24"/>
                             </w:rPr>
                           </w:pPr>
                         </w:p>
@@ -459,20 +469,25 @@
               <v:stroke joinstyle="miter"/>
               <v:path gradientshapeok="t" o:connecttype="rect"/>
             </v:shapetype>
-            <v:shape id="_x0000_s1027" type="#_x0000_t202" style="position:absolute;margin-left:336.35pt;margin-top:9.35pt;width:197.9pt;height:24.85pt;z-index:251673600;visibility:visible;mso-wrap-style:square;mso-width-percent:0;mso-height-percent:0;mso-wrap-distance-left:9pt;mso-wrap-distance-top:0;mso-wrap-distance-right:9pt;mso-wrap-distance-bottom:0;mso-position-horizontal:absolute;mso-position-horizontal-relative:text;mso-position-vertical:absolute;mso-position-vertical-relative:text;mso-width-percent:0;mso-height-percent:0;mso-width-relative:page;mso-height-relative:page;v-text-anchor:top" o:gfxdata="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" filled="f" stroked="f">
+            <v:shape id="Text Box 4" o:spid="_x0000_s1026" type="#_x0000_t202" style="position:absolute;margin-left:357pt;margin-top:7.05pt;width:156pt;height:24.85pt;z-index:251673600;visibility:visible;mso-wrap-style:square;mso-width-percent:0;mso-height-percent:0;mso-wrap-distance-left:9pt;mso-wrap-distance-top:0;mso-wrap-distance-right:9pt;mso-wrap-distance-bottom:0;mso-position-horizontal:absolute;mso-position-horizontal-relative:text;mso-position-vertical:absolute;mso-position-vertical-relative:text;mso-width-percent:0;mso-height-percent:0;mso-width-relative:page;mso-height-relative:page;v-text-anchor:top" o:gfxdata="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" filled="f" stroked="f">
               <v:textbox>
                 <w:txbxContent>
                   <w:p>
                     <w:pPr>
                       <w:spacing w:line="256" w:lineRule="auto"/>
                       <w:jc w:val="center"/>
+                      <w:rPr>
+                        <w:sz w:val="24"/>
+                        <w:szCs w:val="24"/>
+                      </w:rPr>
                     </w:pPr>
                     <w:r>
                       <w:rPr>
                         <w:b/>
                         <w:i/>
                         <w:color w:val="000000"/>
-                        <w:sz w:val="20"/>
+                        <w:sz w:val="24"/>
+                        <w:szCs w:val="24"/>
                       </w:rPr>
                       <w:t>College of Computer Studies</w:t>
                     </w:r>
@@ -485,7 +500,8 @@
                         <w:rFonts w:asciiTheme="minorHAnsi" w:hAnsiTheme="minorHAnsi"/>
                         <w:i/>
                         <w:color w:val="FF0000"/>
-                        <w:sz w:val="22"/>
+                        <w:sz w:val="24"/>
+                        <w:szCs w:val="24"/>
                       </w:rPr>
                     </w:pPr>
                   </w:p>

</xml_diff>

<commit_message>
Add initial implementation of concept paper generation with ai
</commit_message>
<xml_diff>
--- a/ms-word-templates/concept-paper-with-header-and-footer-template.docx
+++ b/ms-word-templates/concept-paper-with-header-and-footer-template.docx
@@ -2304,25 +2304,19 @@
                 <w:rFonts w:cs="Arial"/>
               </w:rPr>
             </w:pPr>
-            <w:r>
-              <w:rPr>
-                <w:rFonts w:cs="Arial"/>
-              </w:rPr>
-              <w:t xml:space="preserve">Monday, November 20, </w:t>
-            </w:r>
             <w:proofErr w:type="gramStart"/>
             <w:r>
               <w:rPr>
                 <w:rFonts w:cs="Arial"/>
               </w:rPr>
-              <w:t>2023</w:t>
+              <w:t>{{ date</w:t>
             </w:r>
             <w:proofErr w:type="gramEnd"/>
             <w:r>
               <w:rPr>
                 <w:rFonts w:cs="Arial"/>
               </w:rPr>
-              <w:t xml:space="preserve"> </w:t>
+              <w:t xml:space="preserve"> }}</w:t>
             </w:r>
           </w:p>
         </w:tc>
@@ -2351,15 +2345,21 @@
               <w:contextualSpacing/>
               <w:rPr>
                 <w:rFonts w:cs="Arial"/>
-                <w:color w:val="FF0000"/>
-              </w:rPr>
-            </w:pPr>
-            <w:r>
-              <w:rPr>
-                <w:rFonts w:cs="Arial"/>
-                <w:color w:val="000000" w:themeColor="text1"/>
-              </w:rPr>
-              <w:t>8:00 AM – 4:00 PM</w:t>
+              </w:rPr>
+            </w:pPr>
+            <w:proofErr w:type="gramStart"/>
+            <w:r>
+              <w:rPr>
+                <w:rFonts w:cs="Arial"/>
+              </w:rPr>
+              <w:t>{{ time</w:t>
+            </w:r>
+            <w:proofErr w:type="gramEnd"/>
+            <w:r>
+              <w:rPr>
+                <w:rFonts w:cs="Arial"/>
+              </w:rPr>
+              <w:t xml:space="preserve"> }}</w:t>
             </w:r>
           </w:p>
         </w:tc>
@@ -2387,12 +2387,13 @@
               <w:spacing w:after="120"/>
               <w:contextualSpacing/>
             </w:pPr>
-            <w:r>
-              <w:rPr>
-                <w:rFonts w:cs="Arial"/>
-                <w:color w:val="000000" w:themeColor="text1"/>
-              </w:rPr>
-              <w:t>New Gymnasium – UPHSD-Molino</w:t>
+            <w:proofErr w:type="gramStart"/>
+            <w:r>
+              <w:t>{{ location</w:t>
+            </w:r>
+            <w:proofErr w:type="gramEnd"/>
+            <w:r>
+              <w:t xml:space="preserve"> }}</w:t>
             </w:r>
           </w:p>
         </w:tc>
@@ -2605,20 +2606,22 @@
       </w:pPr>
       <w:r>
         <w:rPr>
-          <w:lang w:val="en-US"/>
-        </w:rPr>
-        <w:t xml:space="preserve">Dear: </w:t>
-      </w:r>
-      <w:r>
-        <w:rPr>
           <w:noProof/>
         </w:rPr>
         <mc:AlternateContent>
           <mc:Choice Requires="wps">
             <w:drawing>
-              <wp:inline distT="0" distB="0" distL="114300" distR="114300" wp14:anchorId="1F428F4C" wp14:editId="5780067D">
+              <wp:anchor distT="0" distB="0" distL="114300" distR="114300" simplePos="0" relativeHeight="251678720" behindDoc="0" locked="0" layoutInCell="1" allowOverlap="1" wp14:anchorId="1F428F4C" wp14:editId="60F13C36">
+                <wp:simplePos x="0" y="0"/>
+                <wp:positionH relativeFrom="column">
+                  <wp:posOffset>342900</wp:posOffset>
+                </wp:positionH>
+                <wp:positionV relativeFrom="paragraph">
+                  <wp:posOffset>127635</wp:posOffset>
+                </wp:positionV>
                 <wp:extent cx="2690495" cy="15240"/>
                 <wp:effectExtent l="0" t="0" r="14605" b="22860"/>
+                <wp:wrapNone/>
                 <wp:docPr id="926999800" name="Straight Connector 9"/>
                 <wp:cNvGraphicFramePr/>
                 <a:graphic xmlns:a="http://schemas.openxmlformats.org/drawingml/2006/main">
@@ -2647,18 +2650,13 @@
                     </wps:wsp>
                   </a:graphicData>
                 </a:graphic>
-              </wp:inline>
+              </wp:anchor>
             </w:drawing>
           </mc:Choice>
-          <mc:Fallback xmlns:wpsCustomData="http://www.wps.cn/officeDocument/2013/wpsCustomData">
+          <mc:Fallback>
             <w:pict>
-              <v:line id="Straight Connector 9" o:spid="_x0000_s1026" o:spt="20" style="flip:x y;height:1.2pt;width:211.85pt;" filled="f" stroked="t" coordsize="21600,21600" o:gfxdata="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">
-                <v:fill on="f" focussize="0,0"/>
-                <v:stroke weight="0.5pt" color="#000000" miterlimit="8" joinstyle="miter"/>
-                <v:imagedata o:title=""/>
-                <o:lock v:ext="edit" aspectratio="f"/>
-                <w10:wrap type="none"/>
-                <w10:anchorlock/>
+              <v:line w14:anchorId="79E3532A" id="Straight Connector 9" o:spid="_x0000_s1026" style="position:absolute;flip:x y;z-index:251678720;visibility:visible;mso-wrap-style:square;mso-wrap-distance-left:9pt;mso-wrap-distance-top:0;mso-wrap-distance-right:9pt;mso-wrap-distance-bottom:0;mso-position-horizontal:absolute;mso-position-horizontal-relative:text;mso-position-vertical:absolute;mso-position-vertical-relative:text" from="27pt,10.05pt" to="238.85pt,11.25pt" o:gfxdata="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" strokecolor="windowText" strokeweight=".5pt">
+                <v:stroke joinstyle="miter"/>
               </v:line>
             </w:pict>
           </mc:Fallback>
@@ -2666,20 +2664,22 @@
       </w:r>
       <w:r>
         <w:rPr>
-          <w:lang w:val="en-US"/>
-        </w:rPr>
-        <w:t xml:space="preserve">            Subject:</w:t>
-      </w:r>
-      <w:r>
-        <w:rPr>
           <w:noProof/>
         </w:rPr>
         <mc:AlternateContent>
           <mc:Choice Requires="wps">
             <w:drawing>
-              <wp:inline distT="0" distB="0" distL="114300" distR="114300" wp14:anchorId="6585C5DF" wp14:editId="5804DB65">
+              <wp:anchor distT="0" distB="0" distL="114300" distR="114300" simplePos="0" relativeHeight="251677696" behindDoc="0" locked="0" layoutInCell="1" allowOverlap="1" wp14:anchorId="6585C5DF" wp14:editId="24D7BFDE">
+                <wp:simplePos x="0" y="0"/>
+                <wp:positionH relativeFrom="column">
+                  <wp:posOffset>3893820</wp:posOffset>
+                </wp:positionH>
+                <wp:positionV relativeFrom="paragraph">
+                  <wp:posOffset>135255</wp:posOffset>
+                </wp:positionV>
                 <wp:extent cx="1623695" cy="9525"/>
                 <wp:effectExtent l="0" t="0" r="14605" b="28575"/>
+                <wp:wrapNone/>
                 <wp:docPr id="904106599" name="Straight Connector 9"/>
                 <wp:cNvGraphicFramePr/>
                 <a:graphic xmlns:a="http://schemas.openxmlformats.org/drawingml/2006/main">
@@ -2708,23 +2708,36 @@
                     </wps:wsp>
                   </a:graphicData>
                 </a:graphic>
-              </wp:inline>
+              </wp:anchor>
             </w:drawing>
           </mc:Choice>
-          <mc:Fallback xmlns:wpsCustomData="http://www.wps.cn/officeDocument/2013/wpsCustomData">
+          <mc:Fallback>
             <w:pict>
-              <v:line id="Straight Connector 9" o:spid="_x0000_s1026" o:spt="20" style="flip:x y;height:0.75pt;width:127.85pt;" filled="f" stroked="t" coordsize="21600,21600" o:gfxdata="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">
-                <v:fill on="f" focussize="0,0"/>
-                <v:stroke weight="0.5pt" color="#000000" miterlimit="8" joinstyle="miter"/>
-                <v:imagedata o:title=""/>
-                <o:lock v:ext="edit" aspectratio="f"/>
-                <w10:wrap type="none"/>
-                <w10:anchorlock/>
+              <v:line w14:anchorId="166615E2" id="Straight Connector 9" o:spid="_x0000_s1026" style="position:absolute;flip:x y;z-index:251677696;visibility:visible;mso-wrap-style:square;mso-wrap-distance-left:9pt;mso-wrap-distance-top:0;mso-wrap-distance-right:9pt;mso-wrap-distance-bottom:0;mso-position-horizontal:absolute;mso-position-horizontal-relative:text;mso-position-vertical:absolute;mso-position-vertical-relative:text" from="306.6pt,10.65pt" to="434.45pt,11.4pt" o:gfxdata="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" strokecolor="windowText" strokeweight=".5pt">
+                <v:stroke joinstyle="miter"/>
               </v:line>
             </w:pict>
           </mc:Fallback>
         </mc:AlternateContent>
       </w:r>
+      <w:r>
+        <w:rPr>
+          <w:lang w:val="en-US"/>
+        </w:rPr>
+        <w:t xml:space="preserve">Dear:             </w:t>
+      </w:r>
+      <w:r>
+        <w:rPr>
+          <w:lang w:val="en-US"/>
+        </w:rPr>
+        <w:t xml:space="preserve">                                                                                     </w:t>
+      </w:r>
+      <w:r>
+        <w:rPr>
+          <w:lang w:val="en-US"/>
+        </w:rPr>
+        <w:t>Subject:</w:t>
+      </w:r>
     </w:p>
     <w:p>
       <w:pPr>
@@ -2744,7 +2757,23 @@
           <w:iCs/>
           <w:lang w:val="en-US"/>
         </w:rPr>
-        <w:t xml:space="preserve">                            Name of Professor </w:t>
+        <w:t xml:space="preserve">                            </w:t>
+      </w:r>
+      <w:r>
+        <w:rPr>
+          <w:i/>
+          <w:iCs/>
+          <w:lang w:val="en-US"/>
+        </w:rPr>
+        <w:t xml:space="preserve">       </w:t>
+      </w:r>
+      <w:r>
+        <w:rPr>
+          <w:i/>
+          <w:iCs/>
+          <w:lang w:val="en-US"/>
+        </w:rPr>
+        <w:t xml:space="preserve">Name of Professor </w:t>
       </w:r>
     </w:p>
     <w:p>
@@ -2759,20 +2788,22 @@
       </w:pPr>
       <w:r>
         <w:rPr>
-          <w:lang w:val="en-US"/>
-        </w:rPr>
-        <w:t>Day/Date/Time of Class Affected:</w:t>
-      </w:r>
-      <w:r>
-        <w:rPr>
           <w:noProof/>
         </w:rPr>
         <mc:AlternateContent>
           <mc:Choice Requires="wps">
             <w:drawing>
-              <wp:inline distT="0" distB="0" distL="114300" distR="114300" wp14:anchorId="4D61944C" wp14:editId="338302F3">
+              <wp:anchor distT="0" distB="0" distL="114300" distR="114300" simplePos="0" relativeHeight="251679744" behindDoc="0" locked="0" layoutInCell="1" allowOverlap="1" wp14:anchorId="4D61944C" wp14:editId="2357B2BA">
+                <wp:simplePos x="0" y="0"/>
+                <wp:positionH relativeFrom="column">
+                  <wp:posOffset>1897380</wp:posOffset>
+                </wp:positionH>
+                <wp:positionV relativeFrom="paragraph">
+                  <wp:posOffset>121920</wp:posOffset>
+                </wp:positionV>
                 <wp:extent cx="1623695" cy="9525"/>
                 <wp:effectExtent l="0" t="0" r="14605" b="28575"/>
+                <wp:wrapNone/>
                 <wp:docPr id="1110971072" name="Straight Connector 9"/>
                 <wp:cNvGraphicFramePr/>
                 <a:graphic xmlns:a="http://schemas.openxmlformats.org/drawingml/2006/main">
@@ -2801,18 +2832,13 @@
                     </wps:wsp>
                   </a:graphicData>
                 </a:graphic>
-              </wp:inline>
+              </wp:anchor>
             </w:drawing>
           </mc:Choice>
-          <mc:Fallback xmlns:wpsCustomData="http://www.wps.cn/officeDocument/2013/wpsCustomData">
+          <mc:Fallback>
             <w:pict>
-              <v:line id="Straight Connector 9" o:spid="_x0000_s1026" o:spt="20" style="flip:x y;height:0.75pt;width:127.85pt;" filled="f" stroked="t" coordsize="21600,21600" o:gfxdata="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">
-                <v:fill on="f" focussize="0,0"/>
-                <v:stroke weight="0.5pt" color="#000000" miterlimit="8" joinstyle="miter"/>
-                <v:imagedata o:title=""/>
-                <o:lock v:ext="edit" aspectratio="f"/>
-                <w10:wrap type="none"/>
-                <w10:anchorlock/>
+              <v:line w14:anchorId="3405A91F" id="Straight Connector 9" o:spid="_x0000_s1026" style="position:absolute;flip:x y;z-index:251679744;visibility:visible;mso-wrap-style:square;mso-wrap-distance-left:9pt;mso-wrap-distance-top:0;mso-wrap-distance-right:9pt;mso-wrap-distance-bottom:0;mso-position-horizontal:absolute;mso-position-horizontal-relative:text;mso-position-vertical:absolute;mso-position-vertical-relative:text" from="149.4pt,9.6pt" to="277.25pt,10.35pt" o:gfxdata="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" strokecolor="windowText" strokeweight=".5pt">
+                <v:stroke joinstyle="miter"/>
               </v:line>
             </w:pict>
           </mc:Fallback>
@@ -2820,20 +2846,22 @@
       </w:r>
       <w:r>
         <w:rPr>
-          <w:lang w:val="en-US"/>
-        </w:rPr>
-        <w:t xml:space="preserve">      Room Number:</w:t>
-      </w:r>
-      <w:r>
-        <w:rPr>
           <w:noProof/>
         </w:rPr>
         <mc:AlternateContent>
           <mc:Choice Requires="wps">
             <w:drawing>
-              <wp:inline distT="0" distB="0" distL="114300" distR="114300" wp14:anchorId="4414E7DD" wp14:editId="710FDCFA">
+              <wp:anchor distT="0" distB="0" distL="114300" distR="114300" simplePos="0" relativeHeight="251680768" behindDoc="0" locked="0" layoutInCell="1" allowOverlap="1" wp14:anchorId="4414E7DD" wp14:editId="4C3E980E">
+                <wp:simplePos x="0" y="0"/>
+                <wp:positionH relativeFrom="column">
+                  <wp:posOffset>4450080</wp:posOffset>
+                </wp:positionH>
+                <wp:positionV relativeFrom="paragraph">
+                  <wp:posOffset>129540</wp:posOffset>
+                </wp:positionV>
                 <wp:extent cx="1283970" cy="9525"/>
                 <wp:effectExtent l="0" t="0" r="11430" b="28575"/>
+                <wp:wrapNone/>
                 <wp:docPr id="60293702" name="Straight Connector 9"/>
                 <wp:cNvGraphicFramePr/>
                 <a:graphic xmlns:a="http://schemas.openxmlformats.org/drawingml/2006/main">
@@ -2862,22 +2890,35 @@
                     </wps:wsp>
                   </a:graphicData>
                 </a:graphic>
-              </wp:inline>
+              </wp:anchor>
             </w:drawing>
           </mc:Choice>
-          <mc:Fallback xmlns:wpsCustomData="http://www.wps.cn/officeDocument/2013/wpsCustomData">
+          <mc:Fallback>
             <w:pict>
-              <v:line id="Straight Connector 9" o:spid="_x0000_s1026" o:spt="20" style="flip:x y;height:0.75pt;width:101.1pt;" filled="f" stroked="t" coordsize="21600,21600" o:gfxdata="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">
-                <v:fill on="f" focussize="0,0"/>
-                <v:stroke weight="0.5pt" color="#000000" miterlimit="8" joinstyle="miter"/>
-                <v:imagedata o:title=""/>
-                <o:lock v:ext="edit" aspectratio="f"/>
-                <w10:wrap type="none"/>
-                <w10:anchorlock/>
+              <v:line w14:anchorId="5CE4087A" id="Straight Connector 9" o:spid="_x0000_s1026" style="position:absolute;flip:x y;z-index:251680768;visibility:visible;mso-wrap-style:square;mso-wrap-distance-left:9pt;mso-wrap-distance-top:0;mso-wrap-distance-right:9pt;mso-wrap-distance-bottom:0;mso-position-horizontal:absolute;mso-position-horizontal-relative:text;mso-position-vertical:absolute;mso-position-vertical-relative:text" from="350.4pt,10.2pt" to="451.5pt,10.95pt" o:gfxdata="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" strokecolor="windowText" strokeweight=".5pt">
+                <v:stroke joinstyle="miter"/>
               </v:line>
             </w:pict>
           </mc:Fallback>
         </mc:AlternateContent>
+      </w:r>
+      <w:r>
+        <w:rPr>
+          <w:lang w:val="en-US"/>
+        </w:rPr>
+        <w:t xml:space="preserve">Day/Date/Time of Class Affected:      </w:t>
+      </w:r>
+      <w:r>
+        <w:rPr>
+          <w:lang w:val="en-US"/>
+        </w:rPr>
+        <w:t xml:space="preserve">                                               </w:t>
+      </w:r>
+      <w:r>
+        <w:rPr>
+          <w:lang w:val="en-US"/>
+        </w:rPr>
+        <w:t>Room Number:</w:t>
       </w:r>
       <w:r>
         <w:rPr>
@@ -2926,21 +2967,7 @@
         <w:rPr>
           <w:lang w:val="en-US"/>
         </w:rPr>
-        <w:t xml:space="preserve"> your class for they will be attending an activity sponsored by our college. Rest assured that they will be responsible </w:t>
-      </w:r>
-      <w:proofErr w:type="gramStart"/>
-      <w:r>
-        <w:rPr>
-          <w:lang w:val="en-US"/>
-        </w:rPr>
-        <w:t>in</w:t>
-      </w:r>
-      <w:proofErr w:type="gramEnd"/>
-      <w:r>
-        <w:rPr>
-          <w:lang w:val="en-US"/>
-        </w:rPr>
-        <w:t xml:space="preserve"> studying the lesson they had missed during their absence. Kindly see the attached list of the students.</w:t>
+        <w:t xml:space="preserve"> your class for they will be attending an activity sponsored by our college. Rest assured that they will be responsible in studying the lesson they had missed during their absence. Kindly see the attached list of the students.</w:t>
       </w:r>
     </w:p>
     <w:p>
@@ -3333,8 +3360,8 @@
         <w:tblLook w:val="04A0" w:firstRow="1" w:lastRow="0" w:firstColumn="1" w:lastColumn="0" w:noHBand="0" w:noVBand="1"/>
       </w:tblPr>
       <w:tblGrid>
-        <w:gridCol w:w="4864"/>
-        <w:gridCol w:w="4018"/>
+        <w:gridCol w:w="4874"/>
+        <w:gridCol w:w="4008"/>
       </w:tblGrid>
       <w:tr>
         <w:tc>
@@ -3375,12 +3402,21 @@
                 <w:rFonts w:cs="Arial"/>
               </w:rPr>
             </w:pPr>
-            <w:r>
-              <w:rPr>
-                <w:sz w:val="20"/>
-                <w:szCs w:val="20"/>
-              </w:rPr>
-              <w:t>1st National Student Conference "AI Tools in Education"</w:t>
+            <w:proofErr w:type="gramStart"/>
+            <w:r>
+              <w:t xml:space="preserve">{{ </w:t>
+            </w:r>
+            <w:proofErr w:type="spellStart"/>
+            <w:r>
+              <w:t>subject</w:t>
+            </w:r>
+            <w:proofErr w:type="gramEnd"/>
+            <w:r>
+              <w:t>_title</w:t>
+            </w:r>
+            <w:proofErr w:type="spellEnd"/>
+            <w:r>
+              <w:t xml:space="preserve"> }}</w:t>
             </w:r>
           </w:p>
         </w:tc>
@@ -3422,25 +3458,19 @@
                 <w:rFonts w:cs="Arial"/>
               </w:rPr>
             </w:pPr>
-            <w:r>
-              <w:rPr>
-                <w:rFonts w:cs="Arial"/>
-              </w:rPr>
-              <w:t xml:space="preserve">Monday, November 20, </w:t>
-            </w:r>
             <w:proofErr w:type="gramStart"/>
             <w:r>
               <w:rPr>
                 <w:rFonts w:cs="Arial"/>
               </w:rPr>
-              <w:t>2023</w:t>
+              <w:t>{{ date</w:t>
             </w:r>
             <w:proofErr w:type="gramEnd"/>
             <w:r>
               <w:rPr>
                 <w:rFonts w:cs="Arial"/>
               </w:rPr>
-              <w:t xml:space="preserve"> </w:t>
+              <w:t xml:space="preserve"> }}</w:t>
             </w:r>
           </w:p>
         </w:tc>
@@ -3536,17 +3566,21 @@
               <w:contextualSpacing/>
               <w:rPr>
                 <w:rFonts w:cs="Arial"/>
-                <w:color w:val="FF0000"/>
-              </w:rPr>
-            </w:pPr>
-            <w:r>
-              <w:rPr>
-                <w:rFonts w:cs="Arial"/>
-                <w:color w:val="000000" w:themeColor="text1"/>
-                <w:sz w:val="20"/>
-                <w:szCs w:val="20"/>
-              </w:rPr>
-              <w:t>8:00 AM – 4:00 PM</w:t>
+              </w:rPr>
+            </w:pPr>
+            <w:proofErr w:type="gramStart"/>
+            <w:r>
+              <w:rPr>
+                <w:rFonts w:cs="Arial"/>
+              </w:rPr>
+              <w:t>{{ time</w:t>
+            </w:r>
+            <w:proofErr w:type="gramEnd"/>
+            <w:r>
+              <w:rPr>
+                <w:rFonts w:cs="Arial"/>
+              </w:rPr>
+              <w:t xml:space="preserve"> }}</w:t>
             </w:r>
           </w:p>
         </w:tc>
@@ -3635,11 +3669,13 @@
                 <w:szCs w:val="20"/>
               </w:rPr>
             </w:pPr>
-            <w:r>
-              <w:rPr>
-                <w:rFonts w:cs="Arial"/>
-              </w:rPr>
-              <w:t>New Gymnasium – UPHSD-Molino</w:t>
+            <w:proofErr w:type="gramStart"/>
+            <w:r>
+              <w:t>{{ location</w:t>
+            </w:r>
+            <w:proofErr w:type="gramEnd"/>
+            <w:r>
+              <w:t xml:space="preserve"> }}</w:t>
             </w:r>
           </w:p>
         </w:tc>
@@ -4744,6 +4780,42 @@
           <w:lang w:val="en-US"/>
         </w:rPr>
       </w:pPr>
+      <w:proofErr w:type="gramStart"/>
+      <w:r>
+        <w:rPr>
+          <w:b/>
+          <w:bCs/>
+          <w:lang w:val="en-US"/>
+        </w:rPr>
+        <w:t xml:space="preserve">{{ </w:t>
+      </w:r>
+      <w:proofErr w:type="spellStart"/>
+      <w:r>
+        <w:rPr>
+          <w:b/>
+          <w:bCs/>
+          <w:lang w:val="en-US"/>
+        </w:rPr>
+        <w:t>prepared</w:t>
+      </w:r>
+      <w:proofErr w:type="gramEnd"/>
+      <w:r>
+        <w:rPr>
+          <w:b/>
+          <w:bCs/>
+          <w:lang w:val="en-US"/>
+        </w:rPr>
+        <w:t>_by_name</w:t>
+      </w:r>
+      <w:proofErr w:type="spellEnd"/>
+      <w:r>
+        <w:rPr>
+          <w:b/>
+          <w:bCs/>
+          <w:lang w:val="en-US"/>
+        </w:rPr>
+        <w:t xml:space="preserve"> }}</w:t>
+      </w:r>
       <w:r>
         <w:rPr>
           <w:rFonts w:ascii="Calibri" w:eastAsia="MS Mincho" w:hAnsi="Calibri" w:cs="Arial"/>
@@ -4751,7 +4823,7 @@
           <w:bCs/>
           <w:lang w:val="en-US"/>
         </w:rPr>
-        <w:t>GUTIERREZ, PATRICK KYLE E.</w:t>
+        <w:tab/>
       </w:r>
       <w:r>
         <w:rPr>
@@ -4787,27 +4859,7 @@
           <w:bCs/>
           <w:lang w:val="en-US"/>
         </w:rPr>
-        <w:tab/>
-      </w:r>
-      <w:proofErr w:type="gramStart"/>
-      <w:r>
-        <w:rPr>
-          <w:rFonts w:ascii="Calibri" w:eastAsia="MS Mincho" w:hAnsi="Calibri" w:cs="Arial"/>
-          <w:b/>
-          <w:bCs/>
-          <w:lang w:val="en-US"/>
-        </w:rPr>
-        <w:t>{{ signatory</w:t>
-      </w:r>
-      <w:proofErr w:type="gramEnd"/>
-      <w:r>
-        <w:rPr>
-          <w:rFonts w:ascii="Calibri" w:eastAsia="MS Mincho" w:hAnsi="Calibri" w:cs="Arial"/>
-          <w:b/>
-          <w:bCs/>
-          <w:lang w:val="en-US"/>
-        </w:rPr>
-        <w:t>_name_3 }}</w:t>
+        <w:t>{{ signatory_name_3 }}</w:t>
       </w:r>
     </w:p>
     <w:p>
@@ -4820,46 +4872,67 @@
           <w:lang w:val="en-US"/>
         </w:rPr>
       </w:pPr>
+      <w:proofErr w:type="gramStart"/>
+      <w:r>
+        <w:rPr>
+          <w:lang w:val="en-US"/>
+        </w:rPr>
+        <w:t xml:space="preserve">{{ </w:t>
+      </w:r>
+      <w:proofErr w:type="spellStart"/>
+      <w:r>
+        <w:rPr>
+          <w:lang w:val="en-US"/>
+        </w:rPr>
+        <w:t>prepared</w:t>
+      </w:r>
+      <w:proofErr w:type="gramEnd"/>
+      <w:r>
+        <w:rPr>
+          <w:lang w:val="en-US"/>
+        </w:rPr>
+        <w:t>_by_position</w:t>
+      </w:r>
+      <w:proofErr w:type="spellEnd"/>
+      <w:r>
+        <w:rPr>
+          <w:lang w:val="en-US"/>
+        </w:rPr>
+        <w:t xml:space="preserve"> }}, {{ </w:t>
+      </w:r>
+      <w:proofErr w:type="spellStart"/>
+      <w:r>
+        <w:rPr>
+          <w:lang w:val="en-US"/>
+        </w:rPr>
+        <w:t>prepared_by_student_council</w:t>
+      </w:r>
+      <w:proofErr w:type="spellEnd"/>
+      <w:r>
+        <w:rPr>
+          <w:lang w:val="en-US"/>
+        </w:rPr>
+        <w:t xml:space="preserve"> }}</w:t>
+      </w:r>
+      <w:r>
+        <w:tab/>
+      </w:r>
+      <w:r>
+        <w:tab/>
+      </w:r>
+      <w:r>
+        <w:tab/>
+      </w:r>
+      <w:r>
+        <w:tab/>
+      </w:r>
       <w:r>
         <w:rPr>
           <w:rFonts w:ascii="Calibri" w:eastAsia="MS Mincho" w:hAnsi="Calibri" w:cs="Arial"/>
           <w:iCs/>
           <w:lang w:val="en-US"/>
         </w:rPr>
-        <w:t>Business manager, CCS Council</w:t>
-      </w:r>
-      <w:r>
-        <w:t xml:space="preserve"> </w:t>
-      </w:r>
-      <w:r>
-        <w:tab/>
-      </w:r>
-      <w:r>
-        <w:tab/>
-      </w:r>
-      <w:r>
-        <w:tab/>
-      </w:r>
-      <w:r>
-        <w:tab/>
-      </w:r>
-      <w:proofErr w:type="gramStart"/>
-      <w:r>
-        <w:rPr>
-          <w:rFonts w:ascii="Calibri" w:eastAsia="MS Mincho" w:hAnsi="Calibri" w:cs="Arial"/>
-          <w:iCs/>
-          <w:lang w:val="en-US"/>
-        </w:rPr>
-        <w:t>{{ signatory</w:t>
-      </w:r>
-      <w:proofErr w:type="gramEnd"/>
-      <w:r>
-        <w:rPr>
-          <w:rFonts w:ascii="Calibri" w:eastAsia="MS Mincho" w:hAnsi="Calibri" w:cs="Arial"/>
-          <w:iCs/>
-          <w:lang w:val="en-US"/>
-        </w:rPr>
-        <w:t>_position_3 }}, {{ signatory_department_3 }}</w:t>
+        <w:t>{{ signatory_position_3 }}, {{ signatory_department_3 }}</w:t>
       </w:r>
       <w:r>
         <w:rPr>
@@ -5379,9 +5452,9 @@
         <w:tblLook w:val="04A0" w:firstRow="1" w:lastRow="0" w:firstColumn="1" w:lastColumn="0" w:noHBand="0" w:noVBand="1"/>
       </w:tblPr>
       <w:tblGrid>
-        <w:gridCol w:w="3178"/>
-        <w:gridCol w:w="2839"/>
-        <w:gridCol w:w="2235"/>
+        <w:gridCol w:w="3195"/>
+        <w:gridCol w:w="2863"/>
+        <w:gridCol w:w="2194"/>
       </w:tblGrid>
       <w:tr>
         <w:tc>
@@ -5563,19 +5636,25 @@
                 <w:rFonts w:cs="Arial"/>
                 <w:b/>
                 <w:bCs/>
-                <w:color w:val="FF0000"/>
-              </w:rPr>
-            </w:pPr>
+              </w:rPr>
+            </w:pPr>
+            <w:proofErr w:type="gramStart"/>
             <w:r>
               <w:rPr>
                 <w:rFonts w:cs="Arial"/>
                 <w:b/>
                 <w:bCs/>
-                <w:color w:val="000000" w:themeColor="text1"/>
-                <w:sz w:val="20"/>
-                <w:szCs w:val="20"/>
-              </w:rPr>
-              <w:t>8:00 AM – 4:00 AM</w:t>
+              </w:rPr>
+              <w:t>{{ time</w:t>
+            </w:r>
+            <w:proofErr w:type="gramEnd"/>
+            <w:r>
+              <w:rPr>
+                <w:rFonts w:cs="Arial"/>
+                <w:b/>
+                <w:bCs/>
+              </w:rPr>
+              <w:t xml:space="preserve"> }}</w:t>
             </w:r>
           </w:p>
         </w:tc>
@@ -5606,24 +5685,24 @@
                 <w:bCs/>
               </w:rPr>
             </w:pPr>
+            <w:proofErr w:type="gramStart"/>
             <w:r>
               <w:rPr>
                 <w:rFonts w:cs="Arial"/>
                 <w:b/>
                 <w:bCs/>
               </w:rPr>
-              <w:t xml:space="preserve">Monday, November 20, </w:t>
-            </w:r>
-            <w:proofErr w:type="gramStart"/>
+              <w:t>{{ date</w:t>
+            </w:r>
+            <w:proofErr w:type="gramEnd"/>
             <w:r>
               <w:rPr>
                 <w:rFonts w:cs="Arial"/>
                 <w:b/>
                 <w:bCs/>
               </w:rPr>
-              <w:t>2023</w:t>
-            </w:r>
-            <w:proofErr w:type="gramEnd"/>
+              <w:t xml:space="preserve"> }}</w:t>
+            </w:r>
             <w:r>
               <w:rPr>
                 <w:rFonts w:cs="Arial"/>
@@ -5668,13 +5747,23 @@
                 <w:szCs w:val="20"/>
               </w:rPr>
             </w:pPr>
+            <w:proofErr w:type="gramStart"/>
             <w:r>
               <w:rPr>
                 <w:rFonts w:cs="Arial"/>
                 <w:b/>
                 <w:bCs/>
               </w:rPr>
-              <w:t>New Gymnasium – UPHSD- Molino</w:t>
+              <w:t>{{ location</w:t>
+            </w:r>
+            <w:proofErr w:type="gramEnd"/>
+            <w:r>
+              <w:rPr>
+                <w:rFonts w:cs="Arial"/>
+                <w:b/>
+                <w:bCs/>
+              </w:rPr>
+              <w:t xml:space="preserve"> }}</w:t>
             </w:r>
           </w:p>
         </w:tc>
@@ -5711,12 +5800,37 @@
                 <w:bCs/>
               </w:rPr>
             </w:pPr>
+            <w:proofErr w:type="gramStart"/>
             <w:r>
               <w:rPr>
                 <w:b/>
                 <w:bCs/>
               </w:rPr>
-              <w:t>1st National Student Conference "AI Tools in Education"</w:t>
+              <w:t xml:space="preserve">{{ </w:t>
+            </w:r>
+            <w:proofErr w:type="spellStart"/>
+            <w:r>
+              <w:rPr>
+                <w:b/>
+                <w:bCs/>
+              </w:rPr>
+              <w:t>subject</w:t>
+            </w:r>
+            <w:proofErr w:type="gramEnd"/>
+            <w:r>
+              <w:rPr>
+                <w:b/>
+                <w:bCs/>
+              </w:rPr>
+              <w:t>_title</w:t>
+            </w:r>
+            <w:proofErr w:type="spellEnd"/>
+            <w:r>
+              <w:rPr>
+                <w:b/>
+                <w:bCs/>
+              </w:rPr>
+              <w:t xml:space="preserve"> }}</w:t>
             </w:r>
           </w:p>
         </w:tc>
@@ -5765,9 +5879,9 @@
         <w:tblLook w:val="04A0" w:firstRow="1" w:lastRow="0" w:firstColumn="1" w:lastColumn="0" w:noHBand="0" w:noVBand="1"/>
       </w:tblPr>
       <w:tblGrid>
-        <w:gridCol w:w="2952"/>
-        <w:gridCol w:w="2660"/>
-        <w:gridCol w:w="2658"/>
+        <w:gridCol w:w="2917"/>
+        <w:gridCol w:w="2676"/>
+        <w:gridCol w:w="2677"/>
       </w:tblGrid>
       <w:tr>
         <w:tc>
@@ -5787,13 +5901,23 @@
               </w:rPr>
               <w:t xml:space="preserve">Date: </w:t>
             </w:r>
+            <w:proofErr w:type="gramStart"/>
             <w:r>
               <w:rPr>
                 <w:rFonts w:cs="Arial"/>
                 <w:b/>
                 <w:bCs/>
               </w:rPr>
-              <w:t>Monday, November 20, 2023</w:t>
+              <w:t>{{ date</w:t>
+            </w:r>
+            <w:proofErr w:type="gramEnd"/>
+            <w:r>
+              <w:rPr>
+                <w:rFonts w:cs="Arial"/>
+                <w:b/>
+                <w:bCs/>
+              </w:rPr>
+              <w:t xml:space="preserve"> }}</w:t>
             </w:r>
           </w:p>
         </w:tc>
@@ -6416,9 +6540,9 @@
         <w:tblLook w:val="04A0" w:firstRow="1" w:lastRow="0" w:firstColumn="1" w:lastColumn="0" w:noHBand="0" w:noVBand="1"/>
       </w:tblPr>
       <w:tblGrid>
-        <w:gridCol w:w="2456"/>
-        <w:gridCol w:w="2710"/>
-        <w:gridCol w:w="3806"/>
+        <w:gridCol w:w="2472"/>
+        <w:gridCol w:w="2677"/>
+        <w:gridCol w:w="3823"/>
       </w:tblGrid>
       <w:tr>
         <w:trPr>
@@ -6458,8 +6582,21 @@
               <w:spacing w:after="0"/>
               <w:jc w:val="both"/>
             </w:pPr>
-            <w:r>
-              <w:t>1st National Student Conference "AI Tools in Education"</w:t>
+            <w:proofErr w:type="gramStart"/>
+            <w:r>
+              <w:t xml:space="preserve">{{ </w:t>
+            </w:r>
+            <w:proofErr w:type="spellStart"/>
+            <w:r>
+              <w:t>subject</w:t>
+            </w:r>
+            <w:proofErr w:type="gramEnd"/>
+            <w:r>
+              <w:t>_title</w:t>
+            </w:r>
+            <w:proofErr w:type="spellEnd"/>
+            <w:r>
+              <w:t xml:space="preserve"> }}</w:t>
             </w:r>
           </w:p>
         </w:tc>
@@ -6515,7 +6652,21 @@
               <w:rPr>
                 <w:rFonts w:cs="Arial"/>
               </w:rPr>
-              <w:t xml:space="preserve"> Semester, November 20, 2023</w:t>
+              <w:t xml:space="preserve"> Semester, </w:t>
+            </w:r>
+            <w:proofErr w:type="gramStart"/>
+            <w:r>
+              <w:rPr>
+                <w:rFonts w:cs="Arial"/>
+              </w:rPr>
+              <w:t>{{ date</w:t>
+            </w:r>
+            <w:proofErr w:type="gramEnd"/>
+            <w:r>
+              <w:rPr>
+                <w:rFonts w:cs="Arial"/>
+              </w:rPr>
+              <w:t xml:space="preserve"> }}</w:t>
             </w:r>
           </w:p>
         </w:tc>
@@ -6554,15 +6705,21 @@
               <w:spacing w:after="0" w:line="240" w:lineRule="auto"/>
               <w:rPr>
                 <w:rFonts w:cs="Arial"/>
-                <w:color w:val="FF0000"/>
-              </w:rPr>
-            </w:pPr>
-            <w:r>
-              <w:rPr>
-                <w:rFonts w:cs="Arial"/>
-                <w:color w:val="000000" w:themeColor="text1"/>
-              </w:rPr>
-              <w:t>8:00 AM – 4:00 AM</w:t>
+              </w:rPr>
+            </w:pPr>
+            <w:proofErr w:type="gramStart"/>
+            <w:r>
+              <w:rPr>
+                <w:rFonts w:cs="Arial"/>
+              </w:rPr>
+              <w:t>{{ time</w:t>
+            </w:r>
+            <w:proofErr w:type="gramEnd"/>
+            <w:r>
+              <w:rPr>
+                <w:rFonts w:cs="Arial"/>
+              </w:rPr>
+              <w:t xml:space="preserve"> }}</w:t>
             </w:r>
           </w:p>
         </w:tc>
@@ -6598,11 +6755,19 @@
             <w:pPr>
               <w:spacing w:after="0"/>
             </w:pPr>
-            <w:r>
-              <w:rPr>
-                <w:rFonts w:cs="Arial"/>
-              </w:rPr>
-              <w:t>New Gymnasium – UPHSD-Molino</w:t>
+            <w:proofErr w:type="gramStart"/>
+            <w:r>
+              <w:rPr>
+                <w:rFonts w:cs="Arial"/>
+              </w:rPr>
+              <w:t>{{ location</w:t>
+            </w:r>
+            <w:proofErr w:type="gramEnd"/>
+            <w:r>
+              <w:rPr>
+                <w:rFonts w:cs="Arial"/>
+              </w:rPr>
+              <w:t xml:space="preserve"> }}</w:t>
             </w:r>
           </w:p>
         </w:tc>
@@ -7572,7 +7737,7 @@
                 <w:bCs/>
                 <w:color w:val="000000" w:themeColor="text1"/>
               </w:rPr>
-              <w:t xml:space="preserve">Monday, November 20, </w:t>
+              <w:t xml:space="preserve">Monday, </w:t>
             </w:r>
             <w:proofErr w:type="gramStart"/>
             <w:r>
@@ -7582,9 +7747,18 @@
                 <w:bCs/>
                 <w:color w:val="000000" w:themeColor="text1"/>
               </w:rPr>
-              <w:t>2023</w:t>
+              <w:t>{{ date</w:t>
             </w:r>
             <w:proofErr w:type="gramEnd"/>
+            <w:r>
+              <w:rPr>
+                <w:rFonts w:cs="Arial"/>
+                <w:b/>
+                <w:bCs/>
+                <w:color w:val="000000" w:themeColor="text1"/>
+              </w:rPr>
+              <w:t xml:space="preserve"> }}</w:t>
+            </w:r>
             <w:r>
               <w:rPr>
                 <w:rFonts w:cs="Arial"/>
@@ -7629,14 +7803,23 @@
                 <w:bCs/>
               </w:rPr>
             </w:pPr>
+            <w:proofErr w:type="gramStart"/>
             <w:r>
               <w:rPr>
                 <w:rFonts w:cs="Arial"/>
                 <w:b/>
                 <w:bCs/>
-                <w:color w:val="000000" w:themeColor="text1"/>
-              </w:rPr>
-              <w:t>8:00 AM – 4:00 AM</w:t>
+              </w:rPr>
+              <w:t>{{ time</w:t>
+            </w:r>
+            <w:proofErr w:type="gramEnd"/>
+            <w:r>
+              <w:rPr>
+                <w:rFonts w:cs="Arial"/>
+                <w:b/>
+                <w:bCs/>
+              </w:rPr>
+              <w:t xml:space="preserve"> }}</w:t>
             </w:r>
           </w:p>
         </w:tc>
@@ -7679,14 +7862,23 @@
                 <w:bCs/>
               </w:rPr>
             </w:pPr>
-            <w:r>
-              <w:rPr>
-                <w:rFonts w:cs="Calibri"/>
+            <w:proofErr w:type="gramStart"/>
+            <w:r>
+              <w:rPr>
+                <w:rFonts w:cs="Arial"/>
                 <w:b/>
                 <w:bCs/>
-                <w:color w:val="000000" w:themeColor="text1"/>
-              </w:rPr>
-              <w:t>New Gymnasium – UPHSD-Molino</w:t>
+              </w:rPr>
+              <w:t>{{ location</w:t>
+            </w:r>
+            <w:proofErr w:type="gramEnd"/>
+            <w:r>
+              <w:rPr>
+                <w:rFonts w:cs="Arial"/>
+                <w:b/>
+                <w:bCs/>
+              </w:rPr>
+              <w:t xml:space="preserve"> }}</w:t>
             </w:r>
           </w:p>
         </w:tc>

</xml_diff>